<commit_message>
W7 updated Sept 28 2026
</commit_message>
<xml_diff>
--- a/homework/hw07/HW07_Assignment.docx
+++ b/homework/hw07/HW07_Assignment.docx
@@ -83,7 +83,7 @@
           <w:sz w:val="22"/>
           <w:szCs w:val="22"/>
         </w:rPr>
-        <w:t xml:space="preserve">Submit completed HW07_Noise.ipynb to Canvas. All code cells must run without errors.</w:t>
+        <w:t xml:space="preserve">Submit completed HW07_Noise.ipynb to Canvas. All code cells must run without errors, and the AI-use note at the end of the notebook must be filled in.</w:t>
       </w:r>
     </w:p>
     <w:p>
@@ -109,6 +109,20 @@
           <w:szCs w:val="22"/>
         </w:rPr>
         <w:t xml:space="preserve">75 total</w:t>
+      </w:r>
+    </w:p>
+    <w:p>
+      <w:pPr>
+        <w:spacing w:after="120" w:line="276"/>
+      </w:pPr>
+      <w:r>
+        <w:rPr>
+          <w:rFonts w:ascii="Cambria" w:cs="Cambria" w:eastAsia="Cambria" w:hAnsi="Cambria"/>
+          <w:color w:val="333333"/>
+          <w:sz w:val="22"/>
+          <w:szCs w:val="22"/>
+        </w:rPr>
+        <w:t xml:space="preserve">This homework extends Lab 07. Every question uses the Lab 07 model: 8 cm minimum-jerk reaches from Q_REF, with signal-dependent noise (k = 0.15) held for 10 ms, as in Equation 7.4. The notebook provides the model complete, so each answer needs at most two lines of code.</w:t>
       </w:r>
     </w:p>
     <w:p>
@@ -129,21 +143,21 @@
           <w:sz w:val="28"/>
           <w:szCs w:val="28"/>
         </w:rPr>
-        <w:t xml:space="preserve">Q1: Noise Accumulation on the Arc (15 points)</w:t>
-      </w:r>
-    </w:p>
-    <w:p>
-      <w:pPr>
-        <w:spacing w:after="120" w:line="276"/>
-      </w:pPr>
-      <w:r>
-        <w:rPr>
-          <w:rFonts w:ascii="Cambria" w:cs="Cambria" w:eastAsia="Cambria" w:hAnsi="Cambria"/>
-          <w:color w:val="333333"/>
-          <w:sz w:val="22"/>
-          <w:szCs w:val="22"/>
-        </w:rPr>
-        <w:t xml:space="preserve">Run 200 noisy inverse dynamics trials on the 6 cm semicircular arc (T = 800 ms, k = 0.15). Use the forward_sim_noisy function from Lab 07.</w:t>
+        <w:t xml:space="preserve">Q1: When Does the Noise Matter? (15 points)</w:t>
+      </w:r>
+    </w:p>
+    <w:p>
+      <w:pPr>
+        <w:spacing w:after="120" w:line="276"/>
+      </w:pPr>
+      <w:r>
+        <w:rPr>
+          <w:rFonts w:ascii="Cambria" w:cs="Cambria" w:eastAsia="Cambria" w:hAnsi="Cambria"/>
+          <w:color w:val="333333"/>
+          <w:sz w:val="22"/>
+          <w:szCs w:val="22"/>
+        </w:rPr>
+        <w:t xml:space="preserve">Use the 135° reach at T = 500 ms. The notebook records every trial’s hand path. Lecture notes: §3.2 and Equation 7.8.</w:t>
       </w:r>
     </w:p>
     <w:p>
@@ -173,7 +187,7 @@
           <w:sz w:val="22"/>
           <w:szCs w:val="22"/>
         </w:rPr>
-        <w:t xml:space="preserve">Plot all 200 noisy hand paths overlaid on the desired arc. Mark the start position with a diamond marker. Your figure should show the noise fan widening toward the endpoint.</w:t>
+        <w:t xml:space="preserve">Compute the SD of the hand position across trials at every time step: the RMS distance of the hand from its mean position, as in endpoint_sd. Plot SD(t) and report its value halfway through the movement and at the end.</w:t>
       </w:r>
     </w:p>
     <w:p>
@@ -203,7 +217,7 @@
           <w:sz w:val="22"/>
           <w:szCs w:val="22"/>
         </w:rPr>
-        <w:t xml:space="preserve">Compute the path deviation SD at every timestep — the standard deviation (across the 200 trials) of the Euclidean distance between each trial’s hand position and the nominal trajectory at that timestep. Plot SD(t) vs. time in milliseconds.</w:t>
+        <w:t xml:space="preserve">Run the same reach twice more, with the noise switched on only during the first half and then only during the second half. Report the three endpoint SDs, and check that the variances from the two halves add up to the variance with noise throughout.</w:t>
       </w:r>
     </w:p>
     <w:p>
@@ -233,7 +247,7 @@
           <w:sz w:val="22"/>
           <w:szCs w:val="22"/>
         </w:rPr>
-        <w:t xml:space="preserve">Using your SD(t) curve from Q1.2, find the percentage of the movement at which 50% and 90% of the final endpoint SD is reached. Report both values. In 2–3 sentences, explain why the second half of the arc accumulates more noise than the first half.</w:t>
+        <w:t xml:space="preserve">In 2–3 sentences, explain which half contributes more to the endpoint variance, using the factor (T − t)² in Equation 7.8. Then explain why SD(t) in Q1.1 still grows most in the second half.</w:t>
       </w:r>
     </w:p>
     <w:p>
@@ -249,81 +263,81 @@
           <w:sz w:val="28"/>
           <w:szCs w:val="28"/>
         </w:rPr>
-        <w:t xml:space="preserve">Q2: Direction Dependence of Endpoint Scatter (20 points)</w:t>
-      </w:r>
-    </w:p>
-    <w:p>
-      <w:pPr>
-        <w:spacing w:after="120" w:line="276"/>
-      </w:pPr>
-      <w:r>
-        <w:rPr>
-          <w:rFonts w:ascii="Cambria" w:cs="Cambria" w:eastAsia="Cambria" w:hAnsi="Cambria"/>
-          <w:color w:val="333333"/>
-          <w:sz w:val="22"/>
-          <w:szCs w:val="22"/>
-        </w:rPr>
-        <w:t xml:space="preserve">Run 200 noisy ID trials on center-out reaches in four directions (0°, 45°, 90°, 135°), each 10 cm from Q_REF at T = 800 ms. Use a min-jerk trajectory for each direction.</w:t>
-      </w:r>
-    </w:p>
-    <w:p>
-      <w:pPr>
-        <w:spacing w:after="80"/>
-      </w:pPr>
-    </w:p>
-    <w:p>
-      <w:pPr>
-        <w:spacing w:after="120" w:line="276"/>
-      </w:pPr>
-      <w:r>
-        <w:rPr>
-          <w:rFonts w:ascii="Cambria" w:cs="Cambria" w:eastAsia="Cambria" w:hAnsi="Cambria"/>
-          <w:b/>
-          <w:bCs/>
-          <w:color w:val="333333"/>
-          <w:sz w:val="22"/>
-          <w:szCs w:val="22"/>
-        </w:rPr>
-        <w:t xml:space="preserve">Q2.1 (8 pts): </w:t>
-      </w:r>
-      <w:r>
-        <w:rPr>
-          <w:rFonts w:ascii="Cambria" w:cs="Cambria" w:eastAsia="Cambria" w:hAnsi="Cambria"/>
-          <w:color w:val="333333"/>
-          <w:sz w:val="22"/>
-          <w:szCs w:val="22"/>
-        </w:rPr>
-        <w:t xml:space="preserve">Plot the endpoint scatter for all four directions in a 2×2 grid. Mark the target (circle + crosshair) and start position (diamond) in each panel. Report the endpoint SD for each direction.</w:t>
-      </w:r>
-    </w:p>
-    <w:p>
-      <w:pPr>
-        <w:spacing w:after="80"/>
-      </w:pPr>
-    </w:p>
-    <w:p>
-      <w:pPr>
-        <w:spacing w:after="120" w:line="276"/>
-      </w:pPr>
-      <w:r>
-        <w:rPr>
-          <w:rFonts w:ascii="Cambria" w:cs="Cambria" w:eastAsia="Cambria" w:hAnsi="Cambria"/>
-          <w:b/>
-          <w:bCs/>
-          <w:color w:val="333333"/>
-          <w:sz w:val="22"/>
-          <w:szCs w:val="22"/>
-        </w:rPr>
-        <w:t xml:space="preserve">Q2.2 (6 pts): </w:t>
-      </w:r>
-      <w:r>
-        <w:rPr>
-          <w:rFonts w:ascii="Cambria" w:cs="Cambria" w:eastAsia="Cambria" w:hAnsi="Cambria"/>
-          <w:color w:val="333333"/>
-          <w:sz w:val="22"/>
-          <w:szCs w:val="22"/>
-        </w:rPr>
-        <w:t xml:space="preserve">In 2–3 sentences, explain why the endpoint SD differs across directions. Which direction has the largest SD? What determines the torque magnitude for a given reach direction?</w:t>
+        <w:t xml:space="preserve">Q2: A Load Reverses the Tradeoff (20 points)</w:t>
+      </w:r>
+    </w:p>
+    <w:p>
+      <w:pPr>
+        <w:spacing w:after="120" w:line="276"/>
+      </w:pPr>
+      <w:r>
+        <w:rPr>
+          <w:rFonts w:ascii="Cambria" w:cs="Cambria" w:eastAsia="Cambria" w:hAnsi="Cambria"/>
+          <w:color w:val="333333"/>
+          <w:sz w:val="22"/>
+          <w:szCs w:val="22"/>
+        </w:rPr>
+        <w:t xml:space="preserve">Without a load, slowing down always helps, because the required torque shrinks toward zero. Add a constant hand force F = (0, −F) N, pulling toward the body as in Week 6 §3, and test what slowing down does. Lecture notes: §4, §7.4 and Week 6 §3.</w:t>
+      </w:r>
+    </w:p>
+    <w:p>
+      <w:pPr>
+        <w:spacing w:after="80"/>
+      </w:pPr>
+    </w:p>
+    <w:p>
+      <w:pPr>
+        <w:spacing w:after="120" w:line="276"/>
+      </w:pPr>
+      <w:r>
+        <w:rPr>
+          <w:rFonts w:ascii="Cambria" w:cs="Cambria" w:eastAsia="Cambria" w:hAnsi="Cambria"/>
+          <w:b/>
+          <w:bCs/>
+          <w:color w:val="333333"/>
+          <w:sz w:val="22"/>
+          <w:szCs w:val="22"/>
+        </w:rPr>
+        <w:t xml:space="preserve">Q2.1 (6 pts): </w:t>
+      </w:r>
+      <w:r>
+        <w:rPr>
+          <w:rFonts w:ascii="Cambria" w:cs="Cambria" w:eastAsia="Cambria" w:hAnsi="Cambria"/>
+          <w:color w:val="333333"/>
+          <w:sz w:val="22"/>
+          <w:szCs w:val="22"/>
+        </w:rPr>
+        <w:t xml:space="preserve">Complete move_loaded with two lines. The commanded torque must also support the load, so it includes −J(q)ᵀF along the plan. The arm feels the load, so J(q)ᵀF, evaluated at the arm’s actual posture, is added to the torque that moves it. The provided check runs the loaded reach without noise and confirms that it still lands on its target.</w:t>
+      </w:r>
+    </w:p>
+    <w:p>
+      <w:pPr>
+        <w:spacing w:after="80"/>
+      </w:pPr>
+    </w:p>
+    <w:p>
+      <w:pPr>
+        <w:spacing w:after="120" w:line="276"/>
+      </w:pPr>
+      <w:r>
+        <w:rPr>
+          <w:rFonts w:ascii="Cambria" w:cs="Cambria" w:eastAsia="Cambria" w:hAnsi="Cambria"/>
+          <w:b/>
+          <w:bCs/>
+          <w:color w:val="333333"/>
+          <w:sz w:val="22"/>
+          <w:szCs w:val="22"/>
+        </w:rPr>
+        <w:t xml:space="preserve">Q2.2 (8 pts): </w:t>
+      </w:r>
+      <w:r>
+        <w:rPr>
+          <w:rFonts w:ascii="Cambria" w:cs="Cambria" w:eastAsia="Cambria" w:hAnsi="Cambria"/>
+          <w:color w:val="333333"/>
+          <w:sz w:val="22"/>
+          <w:szCs w:val="22"/>
+        </w:rPr>
+        <w:t xml:space="preserve">For the 90° reach, sweep T from 100 ms to 2 s with loads of 0, 0.1, 0.3 and 1 N. Plot the endpoint SD against T on log axes, and report for each load the movement time T* with the smallest SD.</w:t>
       </w:r>
     </w:p>
     <w:p>
@@ -353,7 +367,7 @@
           <w:sz w:val="22"/>
           <w:szCs w:val="22"/>
         </w:rPr>
-        <w:t xml:space="preserve">Compute the Jacobian matrix at the 0° target posture. Based on the Jacobian columns, predict which axis (x or y) should have more endpoint scatter for the 0° reach. Compute the actual SD_x and SD_y from your simulation and state whether your prediction matches.</w:t>
+        <w:t xml:space="preserve">Explain the reversal. Use the four steps of the box in Lecture §4 to show that the load’s noise adds endpoint variance in proportion to T³, while the movement’s noise adds variance in proportion to 1/T. Write SD² ≈ a/T + bF²T³, find T*, and show that T* ∝ F⁻¹ᐟ². Do your values of T* follow this? Finally, the notebook runs Week 6’s 3 N load: what does the result say about what real arms have that this model lacks?</w:t>
       </w:r>
     </w:p>
     <w:p>
@@ -369,21 +383,21 @@
           <w:sz w:val="28"/>
           <w:szCs w:val="28"/>
         </w:rPr>
-        <w:t xml:space="preserve">Q3: Intermittent Feedback Corrections (25 points)</w:t>
-      </w:r>
-    </w:p>
-    <w:p>
-      <w:pPr>
-        <w:spacing w:after="120" w:line="276"/>
-      </w:pPr>
-      <w:r>
-        <w:rPr>
-          <w:rFonts w:ascii="Cambria" w:cs="Cambria" w:eastAsia="Cambria" w:hAnsi="Cambria"/>
-          <w:color w:val="333333"/>
-          <w:sz w:val="22"/>
-          <w:szCs w:val="22"/>
-        </w:rPr>
-        <w:t xml:space="preserve">Build an intermittent feedback controller: a noisy primary reach (T = 500 ms, 10 cm rightward), followed by a 150 ms sensory delay, then a corrective min-jerk to the target (150 ms, also noisy). The scaffold in the notebook handles the primary movement and coast — you fill in the corrective movement.</w:t>
+        <w:t xml:space="preserve">Q3: Corrections With Noisy Senses (25 points)</w:t>
+      </w:r>
+    </w:p>
+    <w:p>
+      <w:pPr>
+        <w:spacing w:after="120" w:line="276"/>
+      </w:pPr>
+      <w:r>
+        <w:rPr>
+          <w:rFonts w:ascii="Cambria" w:cs="Cambria" w:eastAsia="Cambria" w:hAnsi="Cambria"/>
+          <w:color w:val="333333"/>
+          <w:sz w:val="22"/>
+          <w:szCs w:val="22"/>
+        </w:rPr>
+        <w:t xml:space="preserve">Lecture §7 assumed that the controller senses the hand’s position and velocity perfectly, and noted that real senses are noisy. The notebook provides the Lab 07 correcting controller: a 300 ms primary reach, then corrections of 150 ms, each after a 100 ms delay and planned from the sensed position and velocity. Lecture notes: §7 and Equation 7.12.</w:t>
       </w:r>
     </w:p>
     <w:p>
@@ -413,7 +427,7 @@
           <w:sz w:val="22"/>
           <w:szCs w:val="22"/>
         </w:rPr>
-        <w:t xml:space="preserve">Complete the run_with_corrections function. Your corrective movement should: (a) sense the current hand position, (b) plan a min-jerk trajectory from the current position to the target, (c) compute ID torques for this trajectory, and (d) execute with signal-dependent noise. Test with 1 correction and verify the hand gets closer to the target.</w:t>
+        <w:t xml:space="preserve">Complete with_corrections with two lines: add Gaussian noise with SD σ_p to the sensed position, and with SD σ_p / 0.1 s to the sensed velocity. The correction is planned from the sensed state, but the arm starts from its true state. Test with σ_p = 0.5 mm.</w:t>
       </w:r>
     </w:p>
     <w:p>
@@ -443,7 +457,7 @@
           <w:sz w:val="22"/>
           <w:szCs w:val="22"/>
         </w:rPr>
-        <w:t xml:space="preserve">Run 300 trials for 0, 1, and 2 corrections. Plot three panels: (A) hand speed profile for a single trial with and without correction, (B) endpoint scatter for all three conditions, (C) bar chart of endpoint SD. Report the SD values and the percentage improvement from 0 to 1 and from 1 to 2 corrections.</w:t>
+        <w:t xml:space="preserve">For σ_p = 0, 0.25, 0.5 and 1 mm, run the 135° reach with 0–3 corrections. Plot the RMS error against the number of corrections on a log axis. For each σ_p, report the error ratio of the last correction and the Fitts slope from a straight-line fit of movement time against bits delivered. Which slopes fall in the human range of 100–300 ms per bit?</w:t>
       </w:r>
     </w:p>
     <w:p>
@@ -473,7 +487,7 @@
           <w:sz w:val="22"/>
           <w:szCs w:val="22"/>
         </w:rPr>
-        <w:t xml:space="preserve">Can unlimited corrections drive the endpoint SD to zero? Why or why not? Answer in 2–3 sentences, referencing the signal-dependent noise model.</w:t>
+        <w:t xml:space="preserve">Can unlimited corrections drive the endpoint error to zero? Answer in 2–3 sentences for perfect senses and in 2–3 sentences for noisy senses, referring to Equation 7.4.</w:t>
       </w:r>
     </w:p>
     <w:p>
@@ -489,7 +503,21 @@
           <w:sz w:val="28"/>
           <w:szCs w:val="28"/>
         </w:rPr>
-        <w:t xml:space="preserve">Q4: Noise Coefficient Sensitivity (15 points)</w:t>
+        <w:t xml:space="preserve">Q4: The Price of Noise, in Bits (15 points)</w:t>
+      </w:r>
+    </w:p>
+    <w:p>
+      <w:pPr>
+        <w:spacing w:after="120" w:line="276"/>
+      </w:pPr>
+      <w:r>
+        <w:rPr>
+          <w:rFonts w:ascii="Cambria" w:cs="Cambria" w:eastAsia="Cambria" w:hAnsi="Cambria"/>
+          <w:color w:val="333333"/>
+          <w:sz w:val="22"/>
+          <w:szCs w:val="22"/>
+        </w:rPr>
+        <w:t xml:space="preserve">Compare the model with its noise coefficient doubled. Lecture notes: §4.1, §6.2 and Equation 7.9.</w:t>
       </w:r>
     </w:p>
     <w:p>
@@ -519,67 +547,67 @@
           <w:sz w:val="22"/>
           <w:szCs w:val="22"/>
         </w:rPr>
-        <w:t xml:space="preserve">If you double the noise coefficient from k = 0.15 to k = 0.30, by what factor should endpoint SD change? Derive your answer from the SDN model σ(t) = k · |τ(t)|. Show your reasoning.</w:t>
-      </w:r>
-    </w:p>
-    <w:p>
-      <w:pPr>
-        <w:spacing w:after="80"/>
-      </w:pPr>
-    </w:p>
-    <w:p>
-      <w:pPr>
-        <w:spacing w:after="120" w:line="276"/>
-      </w:pPr>
-      <w:r>
-        <w:rPr>
-          <w:rFonts w:ascii="Cambria" w:cs="Cambria" w:eastAsia="Cambria" w:hAnsi="Cambria"/>
-          <w:b/>
-          <w:bCs/>
-          <w:color w:val="333333"/>
-          <w:sz w:val="22"/>
-          <w:szCs w:val="22"/>
-        </w:rPr>
-        <w:t xml:space="preserve">Q4.2 (5 pts): </w:t>
-      </w:r>
-      <w:r>
-        <w:rPr>
-          <w:rFonts w:ascii="Cambria" w:cs="Cambria" w:eastAsia="Cambria" w:hAnsi="Cambria"/>
-          <w:color w:val="333333"/>
-          <w:sz w:val="22"/>
-          <w:szCs w:val="22"/>
-        </w:rPr>
-        <w:t xml:space="preserve">Verify your prediction by running the 6 cm arc Monte Carlo (200 trials, T = 800 ms) at k = 0.15 and k = 0.30. Report both SDs and the ratio.</w:t>
-      </w:r>
-    </w:p>
-    <w:p>
-      <w:pPr>
-        <w:spacing w:after="80"/>
-      </w:pPr>
-    </w:p>
-    <w:p>
-      <w:pPr>
-        <w:spacing w:after="120" w:line="276"/>
-      </w:pPr>
-      <w:r>
-        <w:rPr>
-          <w:rFonts w:ascii="Cambria" w:cs="Cambria" w:eastAsia="Cambria" w:hAnsi="Cambria"/>
-          <w:b/>
-          <w:bCs/>
-          <w:color w:val="333333"/>
-          <w:sz w:val="22"/>
-          <w:szCs w:val="22"/>
-        </w:rPr>
-        <w:t xml:space="preserve">Q4.3 (5 pts): </w:t>
-      </w:r>
-      <w:r>
-        <w:rPr>
-          <w:rFonts w:ascii="Cambria" w:cs="Cambria" w:eastAsia="Cambria" w:hAnsi="Cambria"/>
-          <w:color w:val="333333"/>
-          <w:sz w:val="22"/>
-          <w:szCs w:val="22"/>
-        </w:rPr>
-        <w:t xml:space="preserve">Harris &amp; Wolpert (1998) used k ≈ 0.5 for saccadic eye movements. If you ran your arm simulation at k = 0.5, what endpoint SD would you predict for the 800 ms arc? Would this be physiologically reasonable for arm reaching movements? Answer in 2–3 sentences.</w:t>
+        <w:t xml:space="preserve">If k doubles from 0.15 to 0.30, by what factor does the endpoint SD change at a fixed movement time, and how many bits are lost? Using Equation 7.9, how much longer must the reach take to deliver the same number of bits as before? Show your reasoning.</w:t>
+      </w:r>
+    </w:p>
+    <w:p>
+      <w:pPr>
+        <w:spacing w:after="80"/>
+      </w:pPr>
+    </w:p>
+    <w:p>
+      <w:pPr>
+        <w:spacing w:after="120" w:line="276"/>
+      </w:pPr>
+      <w:r>
+        <w:rPr>
+          <w:rFonts w:ascii="Cambria" w:cs="Cambria" w:eastAsia="Cambria" w:hAnsi="Cambria"/>
+          <w:b/>
+          <w:bCs/>
+          <w:color w:val="333333"/>
+          <w:sz w:val="22"/>
+          <w:szCs w:val="22"/>
+        </w:rPr>
+        <w:t xml:space="preserve">Q4.2 (6 pts): </w:t>
+      </w:r>
+      <w:r>
+        <w:rPr>
+          <w:rFonts w:ascii="Cambria" w:cs="Cambria" w:eastAsia="Cambria" w:hAnsi="Cambria"/>
+          <w:color w:val="333333"/>
+          <w:sz w:val="22"/>
+          <w:szCs w:val="22"/>
+        </w:rPr>
+        <w:t xml:space="preserve">Verify your answers: compute the bits delivered, averaged over the eight directions, for k = 0.15 at 500 ms, k = 0.30 at 500 ms and k = 0.30 at 2000 ms.</w:t>
+      </w:r>
+    </w:p>
+    <w:p>
+      <w:pPr>
+        <w:spacing w:after="80"/>
+      </w:pPr>
+    </w:p>
+    <w:p>
+      <w:pPr>
+        <w:spacing w:after="120" w:line="276"/>
+      </w:pPr>
+      <w:r>
+        <w:rPr>
+          <w:rFonts w:ascii="Cambria" w:cs="Cambria" w:eastAsia="Cambria" w:hAnsi="Cambria"/>
+          <w:b/>
+          <w:bCs/>
+          <w:color w:val="333333"/>
+          <w:sz w:val="22"/>
+          <w:szCs w:val="22"/>
+        </w:rPr>
+        <w:t xml:space="preserve">Q4.3 (4 pts): </w:t>
+      </w:r>
+      <w:r>
+        <w:rPr>
+          <w:rFonts w:ascii="Cambria" w:cs="Cambria" w:eastAsia="Cambria" w:hAnsi="Cambria"/>
+          <w:color w:val="333333"/>
+          <w:sz w:val="22"/>
+          <w:szCs w:val="22"/>
+        </w:rPr>
+        <w:t xml:space="preserve">Lecture §6.2 found that changing k shifts the relationship between movement time and target width without changing its slope. In 2–3 sentences, use your answers to explain why, and what this implies for fitting the model to a person whose motor noise is twice as large.</w:t>
       </w:r>
     </w:p>
     <w:sectPr>

</xml_diff>